<commit_message>
fix(docs): embed genuine OpenXML hyperlinks for GitHub repo and live endpoints
</commit_message>
<xml_diff>
--- a/Darukaa_Advance_AI_Model_Project_Submission.docx
+++ b/Darukaa_Advance_AI_Model_Project_Submission.docx
@@ -67,7 +67,7 @@
                 <w:color w:val="047857"/>
                 <w:sz w:val="22"/>
               </w:rPr>
-              <w:t>🚀 PROJECT SUBMISSION ESSENTIAL LINKS</w:t>
+              <w:t>🚀 PROJECT SUBMISSION ESSENTIAL LINKS (CLICKABLE)</w:t>
             </w:r>
           </w:p>
           <w:p>
@@ -82,14 +82,16 @@
               </w:rPr>
               <w:t xml:space="preserve">• GitHub Repository: </w:t>
             </w:r>
-            <w:r>
-              <w:rPr>
-                <w:color w:val="0284C7"/>
-                <w:sz w:val="20"/>
-                <w:u w:val="single"/>
-              </w:rPr>
-              <w:t>https://github.com/MasterRohitPatil/Darukaa-Earth-</w:t>
-            </w:r>
+            <w:hyperlink r:id="rId9">
+              <w:r>
+                <w:rPr>
+                  <w:color w:val="0284C7"/>
+                  <w:u w:val="single"/>
+                  <w:b/>
+                </w:rPr>
+                <w:t>https://github.com/MasterRohitPatil/Darukaa-Earth-</w:t>
+              </w:r>
+            </w:hyperlink>
           </w:p>
           <w:p>
             <w:pPr>
@@ -103,14 +105,16 @@
               </w:rPr>
               <w:t xml:space="preserve">• Live Production Web App (Vercel): </w:t>
             </w:r>
-            <w:r>
-              <w:rPr>
-                <w:color w:val="0284C7"/>
-                <w:sz w:val="20"/>
-                <w:u w:val="single"/>
-              </w:rPr>
-              <w:t>https://darukaa-earth-theta.vercel.app</w:t>
-            </w:r>
+            <w:hyperlink r:id="rId10">
+              <w:r>
+                <w:rPr>
+                  <w:color w:val="0284C7"/>
+                  <w:u w:val="single"/>
+                  <w:b/>
+                </w:rPr>
+                <w:t>https://darukaa-earth-theta.vercel.app</w:t>
+              </w:r>
+            </w:hyperlink>
           </w:p>
           <w:p>
             <w:pPr>
@@ -124,14 +128,16 @@
               </w:rPr>
               <w:t xml:space="preserve">• Live Backend API Service (Render): </w:t>
             </w:r>
-            <w:r>
-              <w:rPr>
-                <w:color w:val="0284C7"/>
-                <w:sz w:val="20"/>
-                <w:u w:val="single"/>
-              </w:rPr>
-              <w:t>https://darukaa-backend-ayck.onrender.com</w:t>
-            </w:r>
+            <w:hyperlink r:id="rId11">
+              <w:r>
+                <w:rPr>
+                  <w:color w:val="0284C7"/>
+                  <w:u w:val="single"/>
+                  <w:b/>
+                </w:rPr>
+                <w:t>https://darukaa-backend-ayck.onrender.com</w:t>
+              </w:r>
+            </w:hyperlink>
           </w:p>
           <w:p>
             <w:pPr>
@@ -145,14 +151,16 @@
               </w:rPr>
               <w:t xml:space="preserve">• Interactive API Swagger Docs: </w:t>
             </w:r>
-            <w:r>
-              <w:rPr>
-                <w:color w:val="0284C7"/>
-                <w:sz w:val="20"/>
-                <w:u w:val="single"/>
-              </w:rPr>
-              <w:t>https://darukaa-backend-ayck.onrender.com/docs</w:t>
-            </w:r>
+            <w:hyperlink r:id="rId12">
+              <w:r>
+                <w:rPr>
+                  <w:color w:val="0284C7"/>
+                  <w:u w:val="single"/>
+                  <w:b/>
+                </w:rPr>
+                <w:t>https://darukaa-backend-ayck.onrender.com/docs</w:t>
+              </w:r>
+            </w:hyperlink>
           </w:p>
           <w:p>
             <w:pPr>
@@ -164,16 +172,18 @@
                 <w:color w:val="0F172A"/>
                 <w:sz w:val="20"/>
               </w:rPr>
-              <w:t xml:space="preserve">• Health &amp; Diagnostic Endpoint: </w:t>
+              <w:t xml:space="preserve">• Health Diagnostic Endpoint: </w:t>
             </w:r>
-            <w:r>
-              <w:rPr>
-                <w:color w:val="0284C7"/>
-                <w:sz w:val="20"/>
-                <w:u w:val="single"/>
-              </w:rPr>
-              <w:t>https://darukaa-backend-ayck.onrender.com/api/health</w:t>
-            </w:r>
+            <w:hyperlink r:id="rId13">
+              <w:r>
+                <w:rPr>
+                  <w:color w:val="0284C7"/>
+                  <w:u w:val="single"/>
+                  <w:b/>
+                </w:rPr>
+                <w:t>https://darukaa-backend-ayck.onrender.com/api/health</w:t>
+              </w:r>
+            </w:hyperlink>
           </w:p>
         </w:tc>
       </w:tr>
@@ -201,14 +211,16 @@
       <w:r>
         <w:t xml:space="preserve">The project source code is fully committed and synchronized at the GitHub repository: </w:t>
       </w:r>
-      <w:r>
-        <w:rPr>
-          <w:b/>
-          <w:color w:val="0284C7"/>
-          <w:u w:val="single"/>
-        </w:rPr>
-        <w:t>https://github.com/MasterRohitPatil/Darukaa-Earth-</w:t>
-      </w:r>
+      <w:hyperlink r:id="rId9">
+        <w:r>
+          <w:rPr>
+            <w:color w:val="0284C7"/>
+            <w:u w:val="single"/>
+            <w:b/>
+          </w:rPr>
+          <w:t>https://github.com/MasterRohitPatil/Darukaa-Earth-</w:t>
+        </w:r>
+      </w:hyperlink>
     </w:p>
     <w:p>
       <w:r>
@@ -220,13 +232,15 @@
         <w:pStyle w:val="ListBullet"/>
         <w:spacing w:after="40"/>
       </w:pPr>
-      <w:r>
-        <w:rPr>
-          <w:b/>
-          <w:color w:val="0F172A"/>
-        </w:rPr>
-        <w:t>ankita.dasgupta@darukaa.com</w:t>
-      </w:r>
+      <w:hyperlink r:id="rId14">
+        <w:r>
+          <w:rPr>
+            <w:color w:val="0F172A"/>
+            <w:b/>
+          </w:rPr>
+          <w:t>ankita.dasgupta@darukaa.com</w:t>
+        </w:r>
+      </w:hyperlink>
       <w:r>
         <w:t xml:space="preserve"> (Ankita Dasgupta)</w:t>
       </w:r>
@@ -236,13 +250,15 @@
         <w:pStyle w:val="ListBullet"/>
         <w:spacing w:after="40"/>
       </w:pPr>
-      <w:r>
-        <w:rPr>
-          <w:b/>
-          <w:color w:val="0F172A"/>
-        </w:rPr>
-        <w:t>harsh.kumar@darukaa.com</w:t>
-      </w:r>
+      <w:hyperlink r:id="rId15">
+        <w:r>
+          <w:rPr>
+            <w:color w:val="0F172A"/>
+            <w:b/>
+          </w:rPr>
+          <w:t>harsh.kumar@darukaa.com</w:t>
+        </w:r>
+      </w:hyperlink>
       <w:r>
         <w:t xml:space="preserve"> (Harsh Kumar)</w:t>
       </w:r>
@@ -252,13 +268,15 @@
         <w:pStyle w:val="ListBullet"/>
         <w:spacing w:after="40"/>
       </w:pPr>
-      <w:r>
-        <w:rPr>
-          <w:b/>
-          <w:color w:val="0F172A"/>
-        </w:rPr>
-        <w:t>utkarsh.gauniyal@darukaa.com</w:t>
-      </w:r>
+      <w:hyperlink r:id="rId16">
+        <w:r>
+          <w:rPr>
+            <w:color w:val="0F172A"/>
+            <w:b/>
+          </w:rPr>
+          <w:t>utkarsh.gauniyal@darukaa.com</w:t>
+        </w:r>
+      </w:hyperlink>
       <w:r>
         <w:t xml:space="preserve"> (Utkarsh Gauniyal)</w:t>
       </w:r>
@@ -268,13 +286,15 @@
         <w:pStyle w:val="ListBullet"/>
         <w:spacing w:after="40"/>
       </w:pPr>
-      <w:r>
-        <w:rPr>
-          <w:b/>
-          <w:color w:val="0F172A"/>
-        </w:rPr>
-        <w:t>guneet.mutreja@darukaa.com</w:t>
-      </w:r>
+      <w:hyperlink r:id="rId17">
+        <w:r>
+          <w:rPr>
+            <w:color w:val="0F172A"/>
+            <w:b/>
+          </w:rPr>
+          <w:t>guneet.mutreja@darukaa.com</w:t>
+        </w:r>
+      </w:hyperlink>
       <w:r>
         <w:t xml:space="preserve"> (Guneet Mutreja)</w:t>
       </w:r>
@@ -723,7 +743,7 @@
         <w:t xml:space="preserve">Frontend (Decision Cockpit): </w:t>
       </w:r>
       <w:r>
-        <w:t>React 18/19, TypeScript, TailwindCSS v4, Vite, Lucide Icons, Leaflet GIS with OpenStreetMap tiles, Chart.js for interactive analytics, and Canvas Confetti for user feedback. Built with an responsive 3-panel cockpit.</w:t>
+        <w:t>React 18/19, TypeScript, TailwindCSS, Vite, Lucide Icons, Leaflet GIS with OpenStreetMap tiles, Chart.js for interactive analytics, and Canvas Confetti. Responsive 3-panel layout.</w:t>
       </w:r>
     </w:p>
     <w:p>
@@ -784,7 +804,7 @@
     </w:p>
     <w:p>
       <w:r>
-        <w:t>The system utilizes an embedded SQLite database (ecoreason.db) running in Write-Ahead Logging (WAL) mode for instant zero-friction portability and concurrent read/write performance:</w:t>
+        <w:t>The system utilizes an embedded SQLite database (ecoreason.db) running in Write-Ahead Logging (WAL) mode for zero-friction portability and concurrent read/write performance:</w:t>
       </w:r>
     </w:p>
     <w:p>
@@ -1051,7 +1071,19 @@
         <w:t xml:space="preserve">Frontend CI/CD (Vercel): </w:t>
       </w:r>
       <w:r>
-        <w:t>Connected via automated GitHub repository webhook to the `main` branch. Every push executes TypeScript typecheck (`tsc -b`), asset minification via Vite, and deploys globally to Vercel's edge network at https://darukaa-earth-theta.vercel.app.</w:t>
+        <w:t xml:space="preserve">Connected via automated GitHub repository webhook to the main branch. Automatically builds via </w:t>
+      </w:r>
+      <w:hyperlink r:id="rId10">
+        <w:r>
+          <w:rPr>
+            <w:color w:val="0284C7"/>
+            <w:u w:val="single"/>
+          </w:rPr>
+          <w:t>https://darukaa-earth-theta.vercel.app</w:t>
+        </w:r>
+      </w:hyperlink>
+      <w:r>
+        <w:t xml:space="preserve"> with automated TypeScript type checking and global edge distribution.</w:t>
       </w:r>
     </w:p>
     <w:p>
@@ -1065,7 +1097,19 @@
         <w:t xml:space="preserve">Backend CI/CD (Render): </w:t>
       </w:r>
       <w:r>
-        <w:t>Hosted on Render as a cloud Web Service directly synchronized to GitHub `main`. Automatically builds Python dependencies, sets up SQLite WAL storage, and provisions the FastAPI ASGI server with auto-restart.</w:t>
+        <w:t xml:space="preserve">Hosted as a continuous Web Service connected to GitHub main at </w:t>
+      </w:r>
+      <w:hyperlink r:id="rId11">
+        <w:r>
+          <w:rPr>
+            <w:color w:val="0284C7"/>
+            <w:u w:val="single"/>
+          </w:rPr>
+          <w:t>https://darukaa-backend-ayck.onrender.com</w:t>
+        </w:r>
+      </w:hyperlink>
+      <w:r>
+        <w:t xml:space="preserve"> with automated builds, SQLite WAL persistence, and ASGI execution.</w:t>
       </w:r>
     </w:p>
     <w:p>
@@ -1079,21 +1123,19 @@
         <w:t xml:space="preserve">Health &amp; Liveness Probes: </w:t>
       </w:r>
       <w:r>
-        <w:t>An automated monitoring probe runs at `/api/health`, reporting database connection status, Gemini AI service availability, and uptime.</w:t>
+        <w:t xml:space="preserve">Active health check probe located at </w:t>
       </w:r>
-    </w:p>
-    <w:p>
-      <w:pPr>
-        <w:pStyle w:val="ListBullet"/>
-      </w:pPr>
+      <w:hyperlink r:id="rId13">
+        <w:r>
+          <w:rPr>
+            <w:color w:val="0284C7"/>
+            <w:u w:val="single"/>
+          </w:rPr>
+          <w:t>https://darukaa-backend-ayck.onrender.com/api/health</w:t>
+        </w:r>
+      </w:hyperlink>
       <w:r>
-        <w:rPr>
-          <w:b/>
-        </w:rPr>
-        <w:t xml:space="preserve">GitHub Actions CI: </w:t>
-      </w:r>
-      <w:r>
-        <w:t>A continuous integration workflow validates linting, tests, and build artifacts on every push and pull request.</w:t>
+        <w:t>, reporting database connectivity, Gemini AI service status, and runtime uptime.</w:t>
       </w:r>
     </w:p>
     <w:p>

</xml_diff>